<commit_message>
add user: student number required now
</commit_message>
<xml_diff>
--- a/flowcharts/finalizing docu - new diagrams.docx
+++ b/flowcharts/finalizing docu - new diagrams.docx
@@ -15794,7 +15794,7 @@
                     </pic:cNvPicPr>
                   </pic:nvPicPr>
                   <pic:blipFill>
-                    <a:blip r:embed="rId44"/>
+                    <a:blip r:embed="rId43"/>
                     <a:stretch>
                       <a:fillRect/>
                     </a:stretch>
@@ -16035,7 +16035,7 @@
                     </pic:cNvPicPr>
                   </pic:nvPicPr>
                   <pic:blipFill>
-                    <a:blip r:embed="rId45"/>
+                    <a:blip r:embed="rId44"/>
                     <a:stretch>
                       <a:fillRect/>
                     </a:stretch>
@@ -16189,7 +16189,7 @@
                     </pic:cNvPicPr>
                   </pic:nvPicPr>
                   <pic:blipFill>
-                    <a:blip r:embed="rId46"/>
+                    <a:blip r:embed="rId45"/>
                     <a:stretch>
                       <a:fillRect/>
                     </a:stretch>
@@ -16343,7 +16343,7 @@
                     </pic:cNvPicPr>
                   </pic:nvPicPr>
                   <pic:blipFill>
-                    <a:blip r:embed="rId47"/>
+                    <a:blip r:embed="rId46"/>
                     <a:stretch>
                       <a:fillRect/>
                     </a:stretch>
@@ -16481,7 +16481,7 @@
         </w:rPr>
         <w:drawing>
           <wp:inline distT="0" distB="0" distL="0" distR="0">
-            <wp:extent cx="5486400" cy="4987636"/>
+            <wp:extent cx="5486400" cy="6035040"/>
             <wp:effectExtent l="0" t="0" r="0" b="0"/>
             <wp:docPr id="2067999284" name="Figure 10.0 Context Diagram" descr="Figure 10.0 Context Diagram"/>
             <wp:cNvGraphicFramePr>
@@ -16505,7 +16505,7 @@
                   <pic:spPr>
                     <a:xfrm>
                       <a:off x="0" y="0"/>
-                      <a:ext cx="5486400" cy="4987636"/>
+                      <a:ext cx="5486400" cy="6035040"/>
                     </a:xfrm>
                     <a:prstGeom prst="rect">
                       <a:avLst/>
@@ -16525,14 +16525,6 @@
         <w:rPr>
           <w:rFonts w:eastAsiaTheme="minorHAnsi"/>
         </w:rPr>
-        <w:sectPr>
-          <w:headerReference w:type="default" r:id="rId39"/>
-          <w:footerReference w:type="default" r:id="rId40"/>
-          <w:pgSz w:w="12240" w:h="15840"/>
-          <w:pgMar w:top="1440" w:right="1440" w:bottom="1440" w:left="2160" w:header="720" w:footer="701" w:gutter="0"/>
-          <w:cols w:space="720"/>
-          <w:docGrid w:linePitch="360"/>
-        </w:sectPr>
       </w:pPr>
       <w:r>
         <w:rPr>
@@ -16544,6 +16536,7 @@
     <w:p>
       <w:pPr>
         <w:keepNext/>
+        <w:pageBreakBefore/>
         <w:spacing w:after="160" w:line="360" w:lineRule="auto"/>
         <w:rPr>
           <w:rFonts w:eastAsiaTheme="minorHAnsi"/>
@@ -16575,7 +16568,7 @@
         </w:rPr>
         <w:drawing>
           <wp:inline distT="0" distB="0" distL="0" distR="0">
-            <wp:extent cx="7368032" cy="4480560"/>
+            <wp:extent cx="4365024" cy="7178040"/>
             <wp:effectExtent l="0" t="0" r="0" b="0"/>
             <wp:docPr id="2067999285" name="Figure 11.0 Data flow Diagram" descr="Figure 11.0 Data flow Diagram"/>
             <wp:cNvGraphicFramePr>
@@ -16599,7 +16592,7 @@
                   <pic:spPr>
                     <a:xfrm>
                       <a:off x="0" y="0"/>
-                      <a:ext cx="7368032" cy="4480560"/>
+                      <a:ext cx="4365024" cy="7178040"/>
                     </a:xfrm>
                     <a:prstGeom prst="rect">
                       <a:avLst/>
@@ -16619,14 +16612,6 @@
         <w:rPr>
           <w:rFonts w:eastAsiaTheme="minorHAnsi"/>
         </w:rPr>
-        <w:sectPr>
-          <w:headerReference w:type="default" r:id="rId39"/>
-          <w:footerReference w:type="default" r:id="rId43"/>
-          <w:pgSz w:w="15840" w:h="12240" w:orient="landscape"/>
-          <w:pgMar w:top="2160" w:right="1440" w:bottom="1440" w:left="1440" w:header="720" w:footer="701" w:gutter="0"/>
-          <w:cols w:space="720"/>
-          <w:docGrid w:linePitch="360"/>
-        </w:sectPr>
       </w:pPr>
       <w:r>
         <w:rPr>
@@ -16638,6 +16623,7 @@
     <w:p>
       <w:pPr>
         <w:keepNext/>
+        <w:pageBreakBefore/>
         <w:spacing w:after="160" w:line="360" w:lineRule="auto"/>
         <w:rPr>
           <w:rFonts w:eastAsiaTheme="minorHAnsi"/>
@@ -16669,7 +16655,7 @@
         </w:rPr>
         <w:drawing>
           <wp:inline distT="0" distB="0" distL="0" distR="0">
-            <wp:extent cx="5486400" cy="4695092"/>
+            <wp:extent cx="5486400" cy="6411074"/>
             <wp:effectExtent l="0" t="0" r="0" b="0"/>
             <wp:docPr id="2067999286" name="Figure 12.0 Entity Relationship Diagram" descr="Figure 12.0 Entity Relationship Diagram"/>
             <wp:cNvGraphicFramePr>
@@ -16693,7 +16679,7 @@
                   <pic:spPr>
                     <a:xfrm>
                       <a:off x="0" y="0"/>
-                      <a:ext cx="5486400" cy="4695092"/>
+                      <a:ext cx="5486400" cy="6411074"/>
                     </a:xfrm>
                     <a:prstGeom prst="rect">
                       <a:avLst/>
@@ -26279,121 +26265,6 @@
       <w:p>
         <w:pPr>
           <w:pStyle w:val="Footer"/>
-          <w:rPr>
-            <w:rFonts w:ascii="Times New Roman" w:hAnsi="Times New Roman" w:cs="Times New Roman"/>
-            <w:sz w:val="18"/>
-            <w:szCs w:val="18"/>
-          </w:rPr>
-        </w:pPr>
-        <w:r>
-          <w:rPr>
-            <w:rFonts w:ascii="Times New Roman" w:hAnsi="Times New Roman" w:cs="Times New Roman"/>
-            <w:i/>
-            <w:sz w:val="18"/>
-          </w:rPr>
-          <w:t>STI College Sta. Maria</w:t>
-        </w:r>
-        <w:r>
-          <w:rPr>
-            <w:rFonts w:ascii="Times New Roman" w:hAnsi="Times New Roman" w:cs="Times New Roman"/>
-            <w:sz w:val="18"/>
-            <w:szCs w:val="18"/>
-          </w:rPr>
-          <w:t xml:space="preserve"> </w:t>
-        </w:r>
-        <w:r>
-          <w:rPr>
-            <w:rFonts w:ascii="Times New Roman" w:hAnsi="Times New Roman" w:cs="Times New Roman"/>
-            <w:sz w:val="18"/>
-            <w:szCs w:val="18"/>
-          </w:rPr>
-          <w:tab/>
-        </w:r>
-        <w:r>
-          <w:rPr>
-            <w:rFonts w:ascii="Times New Roman" w:hAnsi="Times New Roman" w:cs="Times New Roman"/>
-            <w:sz w:val="18"/>
-            <w:szCs w:val="18"/>
-          </w:rPr>
-          <w:tab/>
-        </w:r>
-        <w:r>
-          <w:rPr>
-            <w:rFonts w:ascii="Times New Roman" w:hAnsi="Times New Roman" w:cs="Times New Roman"/>
-            <w:sz w:val="18"/>
-            <w:szCs w:val="18"/>
-          </w:rPr>
-          <w:fldChar w:fldCharType="begin"/>
-        </w:r>
-        <w:r>
-          <w:rPr>
-            <w:rFonts w:ascii="Times New Roman" w:hAnsi="Times New Roman" w:cs="Times New Roman"/>
-            <w:sz w:val="18"/>
-            <w:szCs w:val="18"/>
-          </w:rPr>
-          <w:instrText xml:space="preserve"> PAGE   \* MERGEFORMAT </w:instrText>
-        </w:r>
-        <w:r>
-          <w:rPr>
-            <w:rFonts w:ascii="Times New Roman" w:hAnsi="Times New Roman" w:cs="Times New Roman"/>
-            <w:sz w:val="18"/>
-            <w:szCs w:val="18"/>
-          </w:rPr>
-          <w:fldChar w:fldCharType="separate"/>
-        </w:r>
-        <w:r>
-          <w:rPr>
-            <w:rFonts w:ascii="Times New Roman" w:hAnsi="Times New Roman" w:cs="Times New Roman"/>
-            <w:sz w:val="18"/>
-            <w:szCs w:val="18"/>
-          </w:rPr>
-          <w:t>58</w:t>
-        </w:r>
-        <w:r>
-          <w:rPr>
-            <w:rFonts w:ascii="Times New Roman" w:hAnsi="Times New Roman" w:cs="Times New Roman"/>
-            <w:sz w:val="18"/>
-            <w:szCs w:val="18"/>
-          </w:rPr>
-          <w:fldChar w:fldCharType="end"/>
-        </w:r>
-      </w:p>
-    </w:sdtContent>
-  </w:sdt>
-  <w:p>
-    <w:pPr>
-      <w:pStyle w:val="Footer"/>
-      <w:rPr>
-        <w:lang w:val="en-GB"/>
-      </w:rPr>
-    </w:pPr>
-  </w:p>
-</w:ftr>
-</file>
-
-<file path=word/footer4.xml><?xml version="1.0" encoding="utf-8"?>
-<w:ftr xmlns:wpc="http://schemas.microsoft.com/office/word/2010/wordprocessingCanvas" xmlns:cx="http://schemas.microsoft.com/office/drawing/2014/chartex" xmlns:cx1="http://schemas.microsoft.com/office/drawing/2015/9/8/chartex" xmlns:cx2="http://schemas.microsoft.com/office/drawing/2015/10/21/chartex" xmlns:cx3="http://schemas.microsoft.com/office/drawing/2016/5/9/chartex" xmlns:cx4="http://schemas.microsoft.com/office/drawing/2016/5/10/chartex" xmlns:cx5="http://schemas.microsoft.com/office/drawing/2016/5/11/chartex" xmlns:cx6="http://schemas.microsoft.com/office/drawing/2016/5/12/chartex" xmlns:cx7="http://schemas.microsoft.com/office/drawing/2016/5/13/chartex" xmlns:cx8="http://schemas.microsoft.com/office/drawing/2016/5/14/chartex" xmlns:mc="http://schemas.openxmlformats.org/markup-compatibility/2006" xmlns:aink="http://schemas.microsoft.com/office/drawing/2016/ink" xmlns:am3d="http://schemas.microsoft.com/office/drawing/2017/model3d" xmlns:o="urn:schemas-microsoft-com:office:office" xmlns:oel="http://schemas.microsoft.com/office/2019/extlst" xmlns:r="http://schemas.openxmlformats.org/officeDocument/2006/relationships" xmlns:m="http://schemas.openxmlformats.org/officeDocument/2006/math" xmlns:v="urn:schemas-microsoft-com:vml" xmlns:wp14="http://schemas.microsoft.com/office/word/2010/wordprocessingDrawing" xmlns:wp="http://schemas.openxmlformats.org/drawingml/2006/wordprocessingDrawing" xmlns:w10="urn:schemas-microsoft-com:office:word" xmlns:w="http://schemas.openxmlformats.org/wordprocessingml/2006/main" xmlns:w14="http://schemas.microsoft.com/office/word/2010/wordml" xmlns:w15="http://schemas.microsoft.com/office/word/2012/wordml" xmlns:w16cex="http://schemas.microsoft.com/office/word/2018/wordml/cex" xmlns:w16cid="http://schemas.microsoft.com/office/word/2016/wordml/cid" xmlns:w16="http://schemas.microsoft.com/office/word/2018/wordml" xmlns:w16du="http://schemas.microsoft.com/office/word/2023/wordml/word16du" xmlns:w16sdtdh="http://schemas.microsoft.com/office/word/2020/wordml/sdtdatahash" xmlns:w16sdtfl="http://schemas.microsoft.com/office/word/2024/wordml/sdtformatlock" xmlns:w16se="http://schemas.microsoft.com/office/word/2015/wordml/symex" xmlns:wpg="http://schemas.microsoft.com/office/word/2010/wordprocessingGroup" xmlns:wpi="http://schemas.microsoft.com/office/word/2010/wordprocessingInk" xmlns:wne="http://schemas.microsoft.com/office/word/2006/wordml" xmlns:wps="http://schemas.microsoft.com/office/word/2010/wordprocessingShape" mc:Ignorable="w14 w15 w16se w16cid w16 w16cex w16sdtdh w16sdtfl w16du wp14">
-  <w:sdt>
-    <w:sdtPr>
-      <w:id w:val="1618508758"/>
-    </w:sdtPr>
-    <w:sdtEndPr>
-      <w:rPr>
-        <w:rFonts w:ascii="Times New Roman" w:hAnsi="Times New Roman" w:cs="Times New Roman"/>
-        <w:sz w:val="18"/>
-        <w:szCs w:val="18"/>
-      </w:rPr>
-    </w:sdtEndPr>
-    <w:sdtContent>
-      <w:p>
-        <w:pPr>
-          <w:pStyle w:val="Footer"/>
-          <w:tabs>
-            <w:tab w:val="clear" w:pos="4680"/>
-            <w:tab w:val="center" w:pos="6480"/>
-            <w:tab w:val="clear" w:pos="9360"/>
-            <w:tab w:val="right" w:pos="13680"/>
-          </w:tabs>
           <w:rPr>
             <w:rFonts w:ascii="Times New Roman" w:hAnsi="Times New Roman" w:cs="Times New Roman"/>
             <w:sz w:val="18"/>

</xml_diff>